<commit_message>
feat: update library UI and sync latest materials
</commit_message>
<xml_diff>
--- a/content/换届选举/2026-06-30-2025/template.docx
+++ b/content/换届选举/2026-06-30-2025/template.docx
@@ -4,16 +4,256 @@
   <w:body>
     <w:p>
       <w:pPr>
-        <w:spacing w:before="480" w:after="480" w:line="288" w:lineRule="auto"/>
-        <w:ind w:left="0"/>
-      </w:pPr>
-      <w:r>
-        <w:rPr>
-          <w:rFonts w:ascii="Arial" w:hAnsi="Arial" w:eastAsia="等线" w:cs="Arial"/>
-          <w:b/>
-          <w:sz w:val="52"/>
+        <w:spacing w:before="0" w:after="360"/>
+        <w:ind w:left="0" w:firstLine="0"/>
+        <w:jc w:val="center"/>
+      </w:pPr>
+      <w:r>
+        <w:rPr>
+          <w:rFonts w:ascii="方正小标宋简体" w:hAnsi="方正小标宋简体" w:eastAsia="方正小标宋简体" w:cs="方正小标宋简体"/>
+          <w:b w:val="0"/>
+          <w:sz w:val="44"/>
         </w:rPr>
         <w:t>换届选举材料（一） | 第一次请示前开会讨论的会议记录参考</w:t>
+      </w:r>
+    </w:p>
+    <w:p>
+      <w:pPr>
+        <w:spacing w:before="0" w:after="0" w:line="560" w:lineRule="exact"/>
+        <w:ind w:left="0" w:firstLine="420"/>
+        <w:jc w:val="center"/>
+        <w:outlineLvl w:val="0"/>
+        <w:rPr>
+          <w:rFonts w:hint="eastAsia" w:ascii="黑体" w:hAnsi="黑体" w:eastAsia="黑体" w:cs="黑体"/>
+          <w:sz w:val="36"/>
+          <w:szCs w:val="36"/>
+        </w:rPr>
+      </w:pPr>
+      <w:bookmarkStart w:id="0" w:name="heading_0"/>
+      <w:r>
+        <w:rPr>
+          <w:rFonts w:hint="eastAsia" w:ascii="黑体" w:hAnsi="黑体" w:eastAsia="黑体" w:cs="黑体"/>
+          <w:b w:val="0"/>
+          <w:sz w:val="36"/>
+          <w:szCs w:val="36"/>
+        </w:rPr>
+        <w:t>会议记录</w:t>
+      </w:r>
+      <w:bookmarkEnd w:id="0"/>
+    </w:p>
+    <w:p>
+      <w:pPr>
+        <w:spacing w:before="0" w:after="0" w:line="560" w:lineRule="exact"/>
+        <w:ind w:left="0" w:firstLine="420"/>
+        <w:jc w:val="both"/>
+        <w:rPr>
+          <w:color w:val="4F81BD" w:themeColor="accent1"/>
+          <w:sz w:val="28"/>
+          <w:szCs w:val="28"/>
+        </w:rPr>
+      </w:pPr>
+      <w:bookmarkStart w:id="1" w:name="_GoBack"/>
+      <w:bookmarkEnd w:id="1"/>
+      <w:r>
+        <w:rPr>
+          <w:rFonts w:ascii="仿宋" w:hAnsi="仿宋" w:eastAsia="仿宋" w:cs="仿宋"/>
+          <w:b w:val="0"/>
+          <w:color w:val="4F81BD" w:themeColor="accent1"/>
+          <w:sz w:val="32"/>
+          <w:szCs w:val="28"/>
+        </w:rPr>
+        <w:t>主题：</w:t>
+      </w:r>
+    </w:p>
+    <w:p>
+      <w:pPr>
+        <w:spacing w:before="0" w:after="0" w:line="560" w:lineRule="exact"/>
+        <w:ind w:left="0" w:firstLine="420"/>
+        <w:jc w:val="both"/>
+        <w:rPr>
+          <w:sz w:val="28"/>
+          <w:szCs w:val="28"/>
+        </w:rPr>
+      </w:pPr>
+      <w:r>
+        <w:rPr>
+          <w:rFonts w:ascii="仿宋" w:hAnsi="仿宋" w:eastAsia="仿宋" w:cs="仿宋"/>
+          <w:b w:val="0"/>
+          <w:sz w:val="32"/>
+          <w:szCs w:val="28"/>
+        </w:rPr>
+        <w:t>研究换届选举有关事宜</w:t>
+      </w:r>
+    </w:p>
+    <w:p>
+      <w:pPr>
+        <w:spacing w:before="0" w:after="0" w:line="560" w:lineRule="exact"/>
+        <w:ind w:left="0" w:firstLine="420"/>
+        <w:jc w:val="both"/>
+        <w:rPr>
+          <w:color w:val="4F81BD" w:themeColor="accent1"/>
+          <w:sz w:val="28"/>
+          <w:szCs w:val="28"/>
+        </w:rPr>
+      </w:pPr>
+      <w:r>
+        <w:rPr>
+          <w:rFonts w:ascii="仿宋" w:hAnsi="仿宋" w:eastAsia="仿宋" w:cs="仿宋"/>
+          <w:b w:val="0"/>
+          <w:color w:val="4F81BD" w:themeColor="accent1"/>
+          <w:sz w:val="32"/>
+          <w:szCs w:val="28"/>
+        </w:rPr>
+        <w:t>记录内容：</w:t>
+      </w:r>
+    </w:p>
+    <w:p>
+      <w:pPr>
+        <w:spacing w:before="0" w:after="0" w:line="560" w:lineRule="exact"/>
+        <w:ind w:left="0" w:firstLine="420"/>
+        <w:jc w:val="both"/>
+        <w:rPr>
+          <w:sz w:val="28"/>
+          <w:szCs w:val="28"/>
+        </w:rPr>
+      </w:pPr>
+      <w:r>
+        <w:rPr>
+          <w:rFonts w:ascii="仿宋" w:hAnsi="仿宋" w:eastAsia="仿宋" w:cs="仿宋"/>
+          <w:b w:val="0"/>
+          <w:sz w:val="32"/>
+          <w:szCs w:val="28"/>
+        </w:rPr>
+        <w:t>XX党支部委员会于XXXX年X月X日选举产生，到XXXX年X月X日任期届满。按照有关规定和上级党组织的要求，现研究召开党员大会进行换届选举的有关事宜，具体包括：</w:t>
+      </w:r>
+    </w:p>
+    <w:p>
+      <w:pPr>
+        <w:spacing w:before="0" w:after="0" w:line="560" w:lineRule="exact"/>
+        <w:ind w:left="0" w:firstLine="420"/>
+        <w:jc w:val="both"/>
+        <w:rPr>
+          <w:sz w:val="28"/>
+          <w:szCs w:val="28"/>
+        </w:rPr>
+      </w:pPr>
+      <w:r>
+        <w:rPr>
+          <w:rFonts w:ascii="仿宋" w:hAnsi="仿宋" w:eastAsia="仿宋" w:cs="仿宋"/>
+          <w:b w:val="0"/>
+          <w:sz w:val="32"/>
+          <w:szCs w:val="28"/>
+        </w:rPr>
+        <w:t>（1）确定按期进行选举：拟于20XX年X月X月召开党员大会。</w:t>
+      </w:r>
+    </w:p>
+    <w:p>
+      <w:pPr>
+        <w:spacing w:before="0" w:after="0" w:line="560" w:lineRule="exact"/>
+        <w:ind w:left="0" w:firstLine="420"/>
+        <w:jc w:val="both"/>
+        <w:rPr>
+          <w:sz w:val="28"/>
+          <w:szCs w:val="28"/>
+        </w:rPr>
+      </w:pPr>
+      <w:r>
+        <w:rPr>
+          <w:rFonts w:ascii="仿宋" w:hAnsi="仿宋" w:eastAsia="仿宋" w:cs="仿宋"/>
+          <w:b w:val="0"/>
+          <w:sz w:val="32"/>
+          <w:szCs w:val="28"/>
+        </w:rPr>
+        <w:t>（2）确定党员大会的主要议程：1.听取和审查本届党支部委员会的工作报告；2.选举新一届党支部委员会。</w:t>
+      </w:r>
+    </w:p>
+    <w:p>
+      <w:pPr>
+        <w:spacing w:before="0" w:after="0" w:line="560" w:lineRule="exact"/>
+        <w:ind w:left="0" w:firstLine="420"/>
+        <w:jc w:val="both"/>
+        <w:rPr>
+          <w:sz w:val="28"/>
+          <w:szCs w:val="28"/>
+        </w:rPr>
+      </w:pPr>
+      <w:r>
+        <w:rPr>
+          <w:rFonts w:ascii="仿宋" w:hAnsi="仿宋" w:eastAsia="仿宋" w:cs="仿宋"/>
+          <w:b w:val="0"/>
+          <w:sz w:val="32"/>
+          <w:szCs w:val="28"/>
+        </w:rPr>
+        <w:t>（3）确定新一届党支部委员会委员名额、候选人名额及差额比例：新一届党支部委员会拟设委员X名，提名委员候选人X名，差额比例为XX%（差额比例不少于应选人数的20%）；拟设书记1名，提名书记候选人1名</w:t>
+      </w:r>
+      <w:r>
+        <w:rPr>
+          <w:rFonts w:ascii="仿宋" w:hAnsi="仿宋" w:eastAsia="仿宋" w:cs="仿宋"/>
+          <w:b w:val="0"/>
+          <w:sz w:val="32"/>
+          <w:szCs w:val="28"/>
+          <w:u w:val="none"/>
+        </w:rPr>
+        <w:t>；拟设副书记1名，提名副书记候选人1名。</w:t>
+      </w:r>
+    </w:p>
+    <w:p>
+      <w:pPr>
+        <w:spacing w:before="0" w:after="0" w:line="560" w:lineRule="exact"/>
+        <w:ind w:left="0" w:firstLine="420"/>
+        <w:jc w:val="both"/>
+        <w:rPr>
+          <w:sz w:val="28"/>
+          <w:szCs w:val="28"/>
+        </w:rPr>
+      </w:pPr>
+      <w:r>
+        <w:rPr>
+          <w:rFonts w:ascii="仿宋" w:hAnsi="仿宋" w:eastAsia="仿宋" w:cs="仿宋"/>
+          <w:b w:val="0"/>
+          <w:sz w:val="32"/>
+          <w:szCs w:val="28"/>
+        </w:rPr>
+        <w:t>（4）确定选举办法：党支部委员会委员由支部党员大会直接采取候选人的差额不少于应选人数的20%的差额选举办法选举产生；党支部委员会书记</w:t>
+      </w:r>
+      <w:r>
+        <w:rPr>
+          <w:rFonts w:ascii="仿宋" w:hAnsi="仿宋" w:eastAsia="仿宋" w:cs="仿宋"/>
+          <w:b w:val="0"/>
+          <w:sz w:val="32"/>
+          <w:szCs w:val="28"/>
+          <w:u w:val="none"/>
+        </w:rPr>
+        <w:t>、副书记（若无则删划线部分）</w:t>
+      </w:r>
+      <w:r>
+        <w:rPr>
+          <w:rFonts w:ascii="仿宋" w:hAnsi="仿宋" w:eastAsia="仿宋" w:cs="仿宋"/>
+          <w:b w:val="0"/>
+          <w:sz w:val="32"/>
+          <w:szCs w:val="28"/>
+        </w:rPr>
+        <w:t>实行等额选举，由新一届党支部委员会第一次全体会议选举产生。以上选举均采用无记名投票方式。</w:t>
+      </w:r>
+    </w:p>
+    <w:p>
+      <w:pPr>
+        <w:spacing w:before="0" w:after="0" w:line="560" w:lineRule="exact"/>
+        <w:ind w:left="0" w:firstLine="420"/>
+        <w:jc w:val="both"/>
+        <w:rPr>
+          <w:sz w:val="28"/>
+          <w:szCs w:val="28"/>
+        </w:rPr>
+      </w:pPr>
+      <w:r>
+        <w:rPr>
+          <w:rFonts w:ascii="仿宋" w:hAnsi="仿宋" w:eastAsia="仿宋" w:cs="仿宋"/>
+          <w:b w:val="0"/>
+          <w:sz w:val="32"/>
+          <w:szCs w:val="28"/>
+        </w:rPr>
+        <w:t>......（如有其他事项可具体补充）</w:t>
       </w:r>
     </w:p>
     <w:p>
@@ -22,333 +262,6 @@
         <w:ind w:left="0"/>
         <w:jc w:val="left"/>
         <w:rPr>
-          <w:color w:val="4F81BD" w:themeColor="accent1"/>
-          <w:sz w:val="28"/>
-          <w:szCs w:val="28"/>
-          <w14:textFill>
-            <w14:solidFill>
-              <w14:schemeClr w14:val="accent1"/>
-            </w14:solidFill>
-          </w14:textFill>
-        </w:rPr>
-      </w:pPr>
-      <w:r>
-        <w:rPr>
-          <w:rFonts w:ascii="Arial" w:hAnsi="Arial" w:eastAsia="等线" w:cs="Arial"/>
-          <w:b/>
-          <w:color w:val="4F81BD" w:themeColor="accent1"/>
-          <w:sz w:val="28"/>
-          <w:szCs w:val="28"/>
-          <w14:textFill>
-            <w14:solidFill>
-              <w14:schemeClr w14:val="accent1"/>
-            </w14:solidFill>
-          </w14:textFill>
-        </w:rPr>
-        <w:t>主题：</w:t>
-      </w:r>
-      <w:bookmarkStart w:id="0" w:name="_GoBack"/>
-      <w:bookmarkEnd w:id="0"/>
-    </w:p>
-    <w:p>
-      <w:pPr>
-        <w:spacing w:before="120" w:after="120" w:line="288" w:lineRule="auto"/>
-        <w:ind w:left="0"/>
-        <w:jc w:val="left"/>
-        <w:rPr>
-          <w:sz w:val="28"/>
-          <w:szCs w:val="28"/>
-        </w:rPr>
-      </w:pPr>
-      <w:r>
-        <w:rPr>
-          <w:rFonts w:ascii="Arial" w:hAnsi="Arial" w:eastAsia="等线" w:cs="Arial"/>
-          <w:sz w:val="28"/>
-          <w:szCs w:val="28"/>
-        </w:rPr>
-        <w:t>研究换届选举有关事宜</w:t>
-      </w:r>
-    </w:p>
-    <w:p>
-      <w:pPr>
-        <w:spacing w:before="120" w:after="120" w:line="288" w:lineRule="auto"/>
-        <w:ind w:left="0"/>
-        <w:jc w:val="left"/>
-        <w:rPr>
-          <w:color w:val="4F81BD" w:themeColor="accent1"/>
-          <w:sz w:val="28"/>
-          <w:szCs w:val="28"/>
-          <w14:textFill>
-            <w14:solidFill>
-              <w14:schemeClr w14:val="accent1"/>
-            </w14:solidFill>
-          </w14:textFill>
-        </w:rPr>
-      </w:pPr>
-      <w:r>
-        <w:rPr>
-          <w:rFonts w:ascii="Arial" w:hAnsi="Arial" w:eastAsia="等线" w:cs="Arial"/>
-          <w:b/>
-          <w:color w:val="4F81BD" w:themeColor="accent1"/>
-          <w:sz w:val="28"/>
-          <w:szCs w:val="28"/>
-          <w14:textFill>
-            <w14:solidFill>
-              <w14:schemeClr w14:val="accent1"/>
-            </w14:solidFill>
-          </w14:textFill>
-        </w:rPr>
-        <w:t>记录内容：</w:t>
-      </w:r>
-    </w:p>
-    <w:p>
-      <w:pPr>
-        <w:spacing w:before="120" w:after="120" w:line="288" w:lineRule="auto"/>
-        <w:ind w:left="0"/>
-        <w:jc w:val="left"/>
-        <w:rPr>
-          <w:sz w:val="28"/>
-          <w:szCs w:val="28"/>
-        </w:rPr>
-      </w:pPr>
-      <w:r>
-        <w:rPr>
-          <w:rFonts w:ascii="Arial" w:hAnsi="Arial" w:eastAsia="等线" w:cs="Arial"/>
-          <w:sz w:val="28"/>
-          <w:szCs w:val="28"/>
-        </w:rPr>
-        <w:t>XX党支部委员会于XXXX年X月X日选举产生，到XXXX年X月X日任期届满。按照有关规定和上级党组织的要求，现研究召开党员大会进行换届选举的有关事宜，具体包括：</w:t>
-      </w:r>
-    </w:p>
-    <w:p>
-      <w:pPr>
-        <w:spacing w:before="120" w:after="120" w:line="288" w:lineRule="auto"/>
-        <w:ind w:left="0"/>
-        <w:jc w:val="left"/>
-        <w:rPr>
-          <w:sz w:val="28"/>
-          <w:szCs w:val="28"/>
-        </w:rPr>
-      </w:pPr>
-      <w:r>
-        <w:rPr>
-          <w:rFonts w:ascii="Arial" w:hAnsi="Arial" w:eastAsia="等线" w:cs="Arial"/>
-          <w:sz w:val="28"/>
-          <w:szCs w:val="28"/>
-        </w:rPr>
-        <w:t>（1）确定</w:t>
-      </w:r>
-      <w:r>
-        <w:rPr>
-          <w:rFonts w:ascii="Arial" w:hAnsi="Arial" w:eastAsia="等线" w:cs="Arial"/>
-          <w:b/>
-          <w:sz w:val="28"/>
-          <w:szCs w:val="28"/>
-        </w:rPr>
-        <w:t>按期进行选举</w:t>
-      </w:r>
-      <w:r>
-        <w:rPr>
-          <w:rFonts w:ascii="Arial" w:hAnsi="Arial" w:eastAsia="等线" w:cs="Arial"/>
-          <w:sz w:val="28"/>
-          <w:szCs w:val="28"/>
-        </w:rPr>
-        <w:t>：拟于</w:t>
-      </w:r>
-      <w:r>
-        <w:rPr>
-          <w:rFonts w:ascii="Arial" w:hAnsi="Arial" w:eastAsia="等线" w:cs="Arial"/>
-          <w:b/>
-          <w:sz w:val="28"/>
-          <w:szCs w:val="28"/>
-        </w:rPr>
-        <w:t>20XX年X月X月</w:t>
-      </w:r>
-      <w:r>
-        <w:rPr>
-          <w:rFonts w:ascii="Arial" w:hAnsi="Arial" w:eastAsia="等线" w:cs="Arial"/>
-          <w:sz w:val="28"/>
-          <w:szCs w:val="28"/>
-        </w:rPr>
-        <w:t>召开党员大会。</w:t>
-      </w:r>
-    </w:p>
-    <w:p>
-      <w:pPr>
-        <w:spacing w:before="120" w:after="120" w:line="288" w:lineRule="auto"/>
-        <w:ind w:left="0"/>
-        <w:jc w:val="left"/>
-        <w:rPr>
-          <w:sz w:val="28"/>
-          <w:szCs w:val="28"/>
-        </w:rPr>
-      </w:pPr>
-      <w:r>
-        <w:rPr>
-          <w:rFonts w:ascii="Arial" w:hAnsi="Arial" w:eastAsia="等线" w:cs="Arial"/>
-          <w:sz w:val="28"/>
-          <w:szCs w:val="28"/>
-        </w:rPr>
-        <w:t>（2）确定党员大会的</w:t>
-      </w:r>
-      <w:r>
-        <w:rPr>
-          <w:rFonts w:ascii="Arial" w:hAnsi="Arial" w:eastAsia="等线" w:cs="Arial"/>
-          <w:b/>
-          <w:sz w:val="28"/>
-          <w:szCs w:val="28"/>
-        </w:rPr>
-        <w:t>主要议程</w:t>
-      </w:r>
-      <w:r>
-        <w:rPr>
-          <w:rFonts w:ascii="Arial" w:hAnsi="Arial" w:eastAsia="等线" w:cs="Arial"/>
-          <w:sz w:val="28"/>
-          <w:szCs w:val="28"/>
-        </w:rPr>
-        <w:t>：1.听取和审查本届党支部委员会的工作报告；2.选举新一届党支部委员会。</w:t>
-      </w:r>
-    </w:p>
-    <w:p>
-      <w:pPr>
-        <w:spacing w:before="120" w:after="120" w:line="288" w:lineRule="auto"/>
-        <w:ind w:left="0"/>
-        <w:jc w:val="left"/>
-        <w:rPr>
-          <w:sz w:val="28"/>
-          <w:szCs w:val="28"/>
-        </w:rPr>
-      </w:pPr>
-      <w:r>
-        <w:rPr>
-          <w:rFonts w:ascii="Arial" w:hAnsi="Arial" w:eastAsia="等线" w:cs="Arial"/>
-          <w:sz w:val="28"/>
-          <w:szCs w:val="28"/>
-        </w:rPr>
-        <w:t>（3）确定</w:t>
-      </w:r>
-      <w:r>
-        <w:rPr>
-          <w:rFonts w:ascii="Arial" w:hAnsi="Arial" w:eastAsia="等线" w:cs="Arial"/>
-          <w:b/>
-          <w:sz w:val="28"/>
-          <w:szCs w:val="28"/>
-        </w:rPr>
-        <w:t>新一届党支部委员会委员名额、候选人名额及差额比例</w:t>
-      </w:r>
-      <w:r>
-        <w:rPr>
-          <w:rFonts w:ascii="Arial" w:hAnsi="Arial" w:eastAsia="等线" w:cs="Arial"/>
-          <w:sz w:val="28"/>
-          <w:szCs w:val="28"/>
-        </w:rPr>
-        <w:t>：新一届党支部委员会拟设委员X名，提名委员候选人X名，差额比例为XX%（差额比例</w:t>
-      </w:r>
-      <w:r>
-        <w:rPr>
-          <w:rFonts w:ascii="Arial" w:hAnsi="Arial" w:eastAsia="等线" w:cs="Arial"/>
-          <w:b/>
-          <w:sz w:val="28"/>
-          <w:szCs w:val="28"/>
-        </w:rPr>
-        <w:t>不少于应选人数的20%</w:t>
-      </w:r>
-      <w:r>
-        <w:rPr>
-          <w:rFonts w:ascii="Arial" w:hAnsi="Arial" w:eastAsia="等线" w:cs="Arial"/>
-          <w:sz w:val="28"/>
-          <w:szCs w:val="28"/>
-        </w:rPr>
-        <w:t>）；拟设书记1名，提名书记候选人1名</w:t>
-      </w:r>
-      <w:r>
-        <w:rPr>
-          <w:rFonts w:ascii="Arial" w:hAnsi="Arial" w:eastAsia="等线" w:cs="Arial"/>
-          <w:sz w:val="28"/>
-          <w:szCs w:val="28"/>
-          <w:u w:val="none"/>
-        </w:rPr>
-        <w:t>；拟设副书记1名，提名副书记候选人1名。</w:t>
-      </w:r>
-    </w:p>
-    <w:p>
-      <w:pPr>
-        <w:spacing w:before="120" w:after="120" w:line="288" w:lineRule="auto"/>
-        <w:ind w:left="0"/>
-        <w:jc w:val="left"/>
-        <w:rPr>
-          <w:sz w:val="28"/>
-          <w:szCs w:val="28"/>
-        </w:rPr>
-      </w:pPr>
-      <w:r>
-        <w:rPr>
-          <w:rFonts w:ascii="Arial" w:hAnsi="Arial" w:eastAsia="等线" w:cs="Arial"/>
-          <w:sz w:val="28"/>
-          <w:szCs w:val="28"/>
-        </w:rPr>
-        <w:t>（4）</w:t>
-      </w:r>
-      <w:r>
-        <w:rPr>
-          <w:rFonts w:ascii="Arial" w:hAnsi="Arial" w:eastAsia="等线" w:cs="Arial"/>
-          <w:b/>
-          <w:sz w:val="28"/>
-          <w:szCs w:val="28"/>
-        </w:rPr>
-        <w:t>确定选举办法</w:t>
-      </w:r>
-      <w:r>
-        <w:rPr>
-          <w:rFonts w:ascii="Arial" w:hAnsi="Arial" w:eastAsia="等线" w:cs="Arial"/>
-          <w:sz w:val="28"/>
-          <w:szCs w:val="28"/>
-        </w:rPr>
-        <w:t>：党支部委员会委员由支部党员大会直接采取候选人的差额不少于应选人数的20%的差额选举办法选举产生；党支部委员会书记</w:t>
-      </w:r>
-      <w:r>
-        <w:rPr>
-          <w:rFonts w:ascii="Arial" w:hAnsi="Arial" w:eastAsia="等线" w:cs="Arial"/>
-          <w:sz w:val="28"/>
-          <w:szCs w:val="28"/>
-          <w:u w:val="none"/>
-        </w:rPr>
-        <w:t>、副书记（若无则删划线部分）</w:t>
-      </w:r>
-      <w:r>
-        <w:rPr>
-          <w:rFonts w:ascii="Arial" w:hAnsi="Arial" w:eastAsia="等线" w:cs="Arial"/>
-          <w:sz w:val="28"/>
-          <w:szCs w:val="28"/>
-        </w:rPr>
-        <w:t>实行等额选举，由新一届党支部委员会第一次全体会议选举产生。以上选举均采用无记名投票方式。</w:t>
-      </w:r>
-    </w:p>
-    <w:p>
-      <w:pPr>
-        <w:spacing w:before="120" w:after="120" w:line="288" w:lineRule="auto"/>
-        <w:ind w:left="0"/>
-        <w:jc w:val="left"/>
-        <w:rPr>
-          <w:sz w:val="28"/>
-          <w:szCs w:val="28"/>
-        </w:rPr>
-      </w:pPr>
-      <w:r>
-        <w:rPr>
-          <w:rFonts w:ascii="Arial" w:hAnsi="Arial" w:eastAsia="等线" w:cs="Arial"/>
-          <w:sz w:val="28"/>
-          <w:szCs w:val="28"/>
-        </w:rPr>
-        <w:t>......（如有其他事项可具体补充）</w:t>
-      </w:r>
-    </w:p>
-    <w:p>
-      <w:pPr>
-        <w:spacing w:before="120" w:after="120" w:line="288" w:lineRule="auto"/>
-        <w:ind w:left="0"/>
-        <w:jc w:val="left"/>
-        <w:rPr>
           <w:sz w:val="28"/>
           <w:szCs w:val="28"/>
         </w:rPr>
@@ -357,7 +270,8 @@
     <w:sectPr>
       <w:headerReference r:id="rId3" w:type="default"/>
       <w:footerReference r:id="rId4" w:type="default"/>
-      <w:pgSz w:w="11905" w:h="16840"/>
+      <w:pgSz w:w="12240" w:h="15840"/>
+      <w:pgMar w:top="1587" w:right="1474" w:bottom="1417" w:left="1587" w:header="720" w:footer="720" w:gutter="0"/>
       <w:cols w:space="720" w:num="1"/>
     </w:sectPr>
   </w:body>
@@ -369,12 +283,17 @@
   <w:p>
     <w:pPr>
       <w:jc w:val="left"/>
+      <w:rPr>
+        <w:rFonts w:hint="eastAsia" w:eastAsia="黑体"/>
+        <w:lang w:val="en-US" w:eastAsia="zh-CN"/>
+      </w:rPr>
     </w:pPr>
     <w:r>
       <w:rPr>
-        <w:rFonts w:ascii="黑体" w:hAnsi="黑体" w:eastAsia="黑体"/>
-        <w:color w:val="B40000"/>
-        <w:sz w:val="21"/>
+        <w:rFonts w:ascii="微软雅黑" w:hAnsi="微软雅黑" w:eastAsia="微软雅黑" w:cs="微软雅黑"/>
+        <w:b w:val="0"/>
+        <w:color w:val="C00000"/>
+        <w:sz w:val="18"/>
       </w:rPr>
       <w:t>www.xiaoxuanvip.com</w:t>
     </w:r>
@@ -390,28 +309,12 @@
     </w:pPr>
     <w:r>
       <w:rPr>
-        <w:rFonts w:ascii="黑体" w:hAnsi="黑体" w:eastAsia="黑体"/>
-        <w:color w:val="B40000"/>
-        <w:sz w:val="21"/>
+        <w:rFonts w:ascii="微软雅黑" w:hAnsi="微软雅黑" w:eastAsia="微软雅黑" w:cs="微软雅黑"/>
+        <w:b w:val="0"/>
+        <w:color w:val="C00000"/>
+        <w:sz w:val="18"/>
       </w:rPr>
-      <w:t>【小宣</w:t>
-    </w:r>
-    <w:r>
-      <w:rPr>
-        <w:rFonts w:hint="eastAsia" w:ascii="黑体" w:hAnsi="黑体" w:eastAsia="黑体"/>
-        <w:color w:val="B40000"/>
-        <w:sz w:val="21"/>
-        <w:lang w:val="en-US" w:eastAsia="zh-CN"/>
-      </w:rPr>
-      <w:t>资料库</w:t>
-    </w:r>
-    <w:r>
-      <w:rPr>
-        <w:rFonts w:ascii="黑体" w:hAnsi="黑体" w:eastAsia="黑体"/>
-        <w:color w:val="B40000"/>
-        <w:sz w:val="21"/>
-      </w:rPr>
-      <w:t>】</w:t>
+      <w:t>小宣资料库</w:t>
     </w:r>
   </w:p>
 </w:hdr>
@@ -531,7 +434,7 @@
     <w:lsdException w:unhideWhenUsed="0" w:uiPriority="0" w:semiHidden="0" w:name="HTML Sample"/>
     <w:lsdException w:unhideWhenUsed="0" w:uiPriority="0" w:semiHidden="0" w:name="HTML Typewriter"/>
     <w:lsdException w:unhideWhenUsed="0" w:uiPriority="0" w:semiHidden="0" w:name="HTML Variable"/>
-    <w:lsdException w:unhideWhenUsed="0" w:uiPriority="0" w:name="Normal Table"/>
+    <w:lsdException w:qFormat="1" w:unhideWhenUsed="0" w:uiPriority="0" w:name="Normal Table"/>
     <w:lsdException w:unhideWhenUsed="0" w:uiPriority="0" w:semiHidden="0" w:name="annotation subject"/>
     <w:lsdException w:unhideWhenUsed="0" w:uiPriority="0" w:semiHidden="0" w:name="Table Simple 1"/>
     <w:lsdException w:unhideWhenUsed="0" w:uiPriority="0" w:semiHidden="0" w:name="Table Simple 2"/>
@@ -700,6 +603,7 @@
   <w:style w:type="table" w:default="1" w:styleId="2">
     <w:name w:val="Normal Table"/>
     <w:semiHidden/>
+    <w:qFormat/>
     <w:uiPriority w:val="0"/>
     <w:tblPr>
       <w:tblCellMar>

</xml_diff>